<commit_message>
KariPom Desktop v0.3: 7 Visualizers + Face を正式反映
実機で動作確認済みの候補コード（7 Visualizers + Face TEST版）を
正式版 karipom_desktop.py として反映。

- 従来の口パク・瞬き・二重瞬き・鼻ヒクヒクは既存ロジックのまま維持
- 顔を含む全8モード（Face + 7種のオーディオビジュアライザー）を
  画面クリックで順送りに切り替え
- 全モードでかりポムの顔を最前面に描画
- Qt.WindowStaysOnTopHintにより、ChatGPTをブラウザで開いたあとも
  KariPom Desktop画面が前面に残る
- 起動時音声ガイダンスを最新の案内文に更新
- macOS / Windows / Linuxの既存対応はそのまま

バージョン表記の統一（動作ロジックへの変更なし）:
- ファイル冒頭コメント・起動時コンソール表示・--helpの説明文・
  ウィンドウタイトルをすべて「KariPom Desktop v0.3」に統一し、
  内部テストファイル由来の「TEST」表記を削除

README.md / KariPom_Desktop_導入ガイド.md/.docx/.pdf も、7種の
オーディオビジュアライザー・クリックでの切り替え・顔の最前面表示・
ChatGPTブラウザ後の前面復帰・新しい起動音声案内に合わせて更新。
導入ガイドは.mdを編集元とし、.docx/.pdfをpandoc/LibreOfficeで
再生成して3形式の内容を一致させた。

LICENSE・karipom-desktop.pngは変更なし。
</commit_message>
<xml_diff>
--- a/KariPom_Desktop_導入ガイド.docx
+++ b/KariPom_Desktop_導入ガイド.docx
@@ -60,6 +60,14 @@
       </w:pPr>
       <w:r>
         <w:t xml:space="preserve">話していないときも、瞬きしたり、鼻をヒクヒクさせたり。</w:t>
+      </w:r>
+    </w:p>
+    <w:p>
+      <w:pPr>
+        <w:pStyle w:val="BlockText"/>
+      </w:pPr>
+      <w:r>
+        <w:t xml:space="preserve">口パクする顔も含めて全7種類のオーディオビジュアライザーを搭載。画面をクリックすると順番に切り替わり、どの表示でもかりポムの顔は最前面に描かれます。</w:t>
       </w:r>
     </w:p>
     <w:p>
@@ -376,7 +384,7 @@
         <w:pStyle w:val="FirstParagraph"/>
       </w:pPr>
       <w:r>
-        <w:t xml:space="preserve">セットアップが完了したら、ChatGPTに案内された方法でKariPom Desktopを起動します。PC画面にかりポムが現れ、標準ブラウザでChatGPTが開きます。</w:t>
+        <w:t xml:space="preserve">セットアップが完了したら、ChatGPTに案内された方法でKariPom Desktopを起動します。PC画面にかりポムが現れ、標準ブラウザでChatGPTが開いたあと、KariPom Desktopの画面が自動的に前面に戻るので、画面を見失う心配はありません。</w:t>
       </w:r>
     </w:p>
     <w:p>
@@ -395,15 +403,7 @@
         <w:pStyle w:val="BlockText"/>
       </w:pPr>
       <w:r>
-        <w:t xml:space="preserve">「こんにちは！ ブラウザでChatGPTも開きました。</w:t>
-      </w:r>
-    </w:p>
-    <w:p>
-      <w:pPr>
-        <w:pStyle w:val="BlockText"/>
-      </w:pPr>
-      <w:r>
-        <w:t xml:space="preserve">ChatGPTの入力欄の右側にある音声ボタンを押して、かりポムとお話ししましょう。」</w:t>
+        <w:t xml:space="preserve">「こんにちは、かりポムです！ ブラウザでChatGPTも開きました。ChatGPTの音声ボタンを押して会話を始めましょう。かりポム画面をクリックすると、顔のオーディオビジュアライザーを切り替えられます。」</w:t>
       </w:r>
     </w:p>
     <w:p>
@@ -412,6 +412,14 @@
       </w:pPr>
       <w:r>
         <w:t xml:space="preserve">音声会話を開始すると、ChatGPTの声に合わせてかりポムが口を動かします。何も話していないときも、瞬きや鼻の動きで過ごします。</w:t>
+      </w:r>
+    </w:p>
+    <w:p>
+      <w:pPr>
+        <w:pStyle w:val="BodyText"/>
+      </w:pPr>
+      <w:r>
+        <w:t xml:space="preserve">KariPom Desktopの画面をクリックすると、口パクする通常の「顔」を含めて全7種類のオーディオビジュアライザーが順番に切り替わります。どの表示中でも、かりポムの顔は常に最前面に描かれます。</w:t>
       </w:r>
     </w:p>
     <w:p>

</xml_diff>

<commit_message>
Replace BlackHole with ScreenCaptureKit on macOS, add BBX nav chevrons
Migrate macOS PC-audio capture from BlackHole 2ch + Multi-Output Device
to Apple ScreenCaptureKit (macOS 13 Ventura+, no extra driver, one-time
recording permission). Verified on real hardware. Sync README and the
setup guide (md/docx/pdf) to the new instructions. Also add a
drawn-only chevron hint to the Character/Visualizer/Lighting 3-button
row (click zones and labels unchanged).
</commit_message>
<xml_diff>
--- a/KariPom_Desktop_導入ガイド.docx
+++ b/KariPom_Desktop_導入ガイド.docx
@@ -340,7 +340,7 @@
         <w:pStyle w:val="FirstParagraph"/>
       </w:pPr>
       <w:r>
-        <w:t xml:space="preserve">macOSでは、PCで再生されるChatGPTなどの音声をかりポムに聞かせるため、BlackHole 2chなどの仮想オーディオデバイスを利用します。また、Macのスピーカーから音を出しながらBlackHoleにも同じ音声を送るため、Audio MIDI設定で複数出力装置を設定する必要があります。</w:t>
+        <w:t xml:space="preserve">macOSでは、Apple純正のScreenCaptureKitを使ってPCの再生音を直接取得するため、BlackHoleなどの仮想オーディオデバイスやAudio MIDI設定の複数出力装置は必要ありません。対応OSはmacOS 13 Ventura以降です。</w:t>
       </w:r>
     </w:p>
     <w:p>
@@ -348,7 +348,15 @@
         <w:pStyle w:val="BodyText"/>
       </w:pPr>
       <w:r>
-        <w:t xml:space="preserve">設定が分からない場合は、ChatGPTに次のように聞いてください。</w:t>
+        <w:t xml:space="preserve">初回起動時に、macOSから「画面とシステムオーディオの録音」の許可を求められるので、許可してください。</w:t>
+      </w:r>
+    </w:p>
+    <w:p>
+      <w:pPr>
+        <w:pStyle w:val="BodyText"/>
+      </w:pPr>
+      <w:r>
+        <w:t xml:space="preserve">許可し忘れた場合や、あとから確認したい場合は、ChatGPTに次のように聞いてください。</w:t>
       </w:r>
     </w:p>
     <w:p>
@@ -356,7 +364,7 @@
         <w:pStyle w:val="BlockText"/>
       </w:pPr>
       <w:r>
-        <w:t xml:space="preserve">「Macで、スピーカーから音を出しながらBlackHole 2chにも同じ音声を送る設定を教えて」</w:t>
+        <w:t xml:space="preserve">「Macで、KariPom Desktopに画面とシステムオーディオの録音を許可する設定を教えて」</w:t>
       </w:r>
     </w:p>
     <w:p>

</xml_diff>